<commit_message>
updated live links and fixed UI layouts
</commit_message>
<xml_diff>
--- a/assets/Ayush_Resume 2 1 (1).docx
+++ b/assets/Ayush_Resume 2 1 (1).docx
@@ -164,8 +164,10 @@
         <w:r>
           <w:rPr>
             <w:rStyle w:val="Hyperlink"/>
+            <w:b/>
+            <w:bCs/>
           </w:rPr>
-          <w:t>Ayush Tewari | Frontend Developer</w:t>
+          <w:t>https://ayush15601.github.io/Portfolio/</w:t>
         </w:r>
       </w:hyperlink>
     </w:p>
@@ -1239,7 +1241,7 @@
                 </mc:Choice>
                 <mc:Fallback>
                   <w:pict>
-                    <v:group w14:anchorId="00CD3033" id="Group 1" o:spid="_x0000_s1026" style="position:absolute;margin-left:.7pt;margin-top:0;width:517.7pt;height:19.75pt;z-index:-251655680;mso-wrap-distance-left:0;mso-wrap-distance-right:0" coordsize="65747,2508" o:gfxdata="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">
+                    <v:group w14:anchorId="4996CD65" id="Group 1" o:spid="_x0000_s1026" style="position:absolute;margin-left:.7pt;margin-top:0;width:517.7pt;height:19.75pt;z-index:-251655680;mso-wrap-distance-left:0;mso-wrap-distance-right:0" coordsize="65747,2508" o:gfxdata="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">
                       <v:shape id="Graphic 2" o:spid="_x0000_s1027" style="position:absolute;top:2444;width:65747;height:64;visibility:visible;mso-wrap-style:square;v-text-anchor:top" coordsize="6574790,6350" o:gfxdata="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" path="m1146352,l,,,6096r1146352,l1146352,xem1152461,r-6083,l1146378,6096r6083,l1152461,xem2076627,l1152474,r,6096l2076627,6096r,-6096xem2082736,r-6083,l2076653,6096r6083,l2082736,xem6574231,l4143705,r-5969,l4137609,,2082749,r,6096l4137609,6096r127,l4143705,6096r2430526,l6574231,xe" fillcolor="black" stroked="f">
                         <v:path arrowok="t"/>
                       </v:shape>
@@ -1442,7 +1444,6 @@
               </w:rPr>
               <w:t xml:space="preserve"> </w:t>
             </w:r>
-            <w:proofErr w:type="gramStart"/>
             <w:r>
               <w:rPr>
                 <w:b/>
@@ -1451,18 +1452,7 @@
                 <w:sz w:val="20"/>
                 <w:szCs w:val="20"/>
               </w:rPr>
-              <w:t>Marks(</w:t>
-            </w:r>
-            <w:proofErr w:type="gramEnd"/>
-            <w:r>
-              <w:rPr>
-                <w:b/>
-                <w:bCs/>
-                <w:spacing w:val="-2"/>
-                <w:sz w:val="20"/>
-                <w:szCs w:val="20"/>
-              </w:rPr>
-              <w:t>%)</w:t>
+              <w:t>Marks(%)</w:t>
             </w:r>
           </w:p>
         </w:tc>

</xml_diff>